<commit_message>
feat: unify public template with SYSTEMX and private webapp tooling
</commit_message>
<xml_diff>
--- a/.SYSTEMX/KIT/Production/Standard Document Set/DOCX/00_Executive_Letterhead_Template.docx
+++ b/.SYSTEMX/KIT/Production/Standard Document Set/DOCX/00_Executive_Letterhead_Template.docx
@@ -25,7 +25,7 @@
           <w:color w:val="5B6573"/>
           <w:sz w:val="24"/>
         </w:rPr>
-        <w:t>Professional letterhead template for authorized Wayne Tech Lab LLC. communications.</w:t>
+        <w:t>Professional letterhead template for authorized [[COMPANY NAME]] communications.</w:t>
       </w:r>
     </w:p>
     <w:tbl>
@@ -120,7 +120,7 @@
               <w:rPr>
                 <w:sz w:val="17"/>
               </w:rPr>
-              <w:t>Wayne Tech Lab LLC.</w:t>
+              <w:t>[[COMPANY NAME]]</w:t>
             </w:r>
           </w:p>
         </w:tc>
@@ -532,7 +532,7 @@
         <w:br/>
         <w:t>[[TITLE]]</w:t>
         <w:br/>
-        <w:t>Wayne Tech Lab LLC.</w:t>
+        <w:t>[[COMPANY NAME]]</w:t>
       </w:r>
     </w:p>
     <w:sectPr>
@@ -562,7 +562,7 @@
         <w:color w:val="5B6573"/>
         <w:sz w:val="15"/>
       </w:rPr>
-      <w:t>Wayne Tech Lab LLC. | www.WayneTechLab.com | Lucas@WayneTechLab.com | Salem, Oregon</w:t>
+      <w:t>[[COMPANY NAME]] | example.com | [[CONTACT EMAIL]] | [[CITY, REGION]]</w:t>
     </w:r>
   </w:p>
   <w:p>
@@ -671,7 +671,7 @@
               <w:color w:val="01214A"/>
               <w:sz w:val="21"/>
             </w:rPr>
-            <w:t>WAYNE TECH LAB LLC.</w:t>
+            <w:t>[[COMPANY NAME]]</w:t>
           </w:r>
           <w:r>
             <w:rPr>

</xml_diff>